<commit_message>
A10 internship is done, updating the stuff
</commit_message>
<xml_diff>
--- a/Kunj.docx
+++ b/Kunj.docx
@@ -2711,7 +2711,7 @@
           <w:sz w:val="21"/>
           <w:szCs w:val="21"/>
         </w:rPr>
-        <w:t>Networking</w:t>
+        <w:t>Networks</w:t>
       </w:r>
       <w:r>
         <w:rPr>
@@ -2721,7 +2721,107 @@
           <w:sz w:val="21"/>
           <w:szCs w:val="21"/>
         </w:rPr>
-        <w:t xml:space="preserve"> </w:t>
+        <w:tab/>
+      </w:r>
+      <w:r>
+        <w:rPr>
+          <w:b/>
+          <w:color w:val="000000"/>
+          <w:spacing w:val="7381"/>
+          <w:sz w:val="21"/>
+          <w:szCs w:val="21"/>
+        </w:rPr>
+        <w:tab/>
+      </w:r>
+      <w:r>
+        <w:rPr>
+          <w:b/>
+          <w:color w:val="000000"/>
+          <w:spacing w:val="7381"/>
+          <w:sz w:val="21"/>
+          <w:szCs w:val="21"/>
+        </w:rPr>
+        <w:tab/>
+      </w:r>
+      <w:r>
+        <w:rPr>
+          <w:b/>
+          <w:color w:val="000000"/>
+          <w:spacing w:val="7381"/>
+          <w:sz w:val="21"/>
+          <w:szCs w:val="21"/>
+        </w:rPr>
+        <w:tab/>
+      </w:r>
+      <w:r>
+        <w:rPr>
+          <w:b/>
+          <w:color w:val="000000"/>
+          <w:spacing w:val="7381"/>
+          <w:sz w:val="21"/>
+          <w:szCs w:val="21"/>
+        </w:rPr>
+        <w:tab/>
+      </w:r>
+      <w:r>
+        <w:rPr>
+          <w:b/>
+          <w:color w:val="000000"/>
+          <w:spacing w:val="7381"/>
+          <w:sz w:val="21"/>
+          <w:szCs w:val="21"/>
+        </w:rPr>
+        <w:tab/>
+      </w:r>
+      <w:r>
+        <w:rPr>
+          <w:b/>
+          <w:color w:val="000000"/>
+          <w:spacing w:val="7381"/>
+          <w:sz w:val="21"/>
+          <w:szCs w:val="21"/>
+        </w:rPr>
+        <w:tab/>
+      </w:r>
+      <w:r>
+        <w:rPr>
+          <w:b/>
+          <w:color w:val="000000"/>
+          <w:spacing w:val="7381"/>
+          <w:sz w:val="21"/>
+          <w:szCs w:val="21"/>
+        </w:rPr>
+        <w:tab/>
+      </w:r>
+      <w:r>
+        <w:rPr>
+          <w:b/>
+          <w:color w:val="000000"/>
+          <w:spacing w:val="7381"/>
+          <w:sz w:val="21"/>
+          <w:szCs w:val="21"/>
+        </w:rPr>
+        <w:tab/>
+      </w:r>
+      <w:r>
+        <w:rPr>
+          <w:b/>
+          <w:color w:val="000000"/>
+          <w:spacing w:val="7381"/>
+          <w:sz w:val="21"/>
+          <w:szCs w:val="21"/>
+        </w:rPr>
+        <w:tab/>
+      </w:r>
+      <w:r>
+        <w:rPr>
+          <w:b/>
+          <w:color w:val="000000"/>
+          <w:spacing w:val="7381"/>
+          <w:sz w:val="21"/>
+          <w:szCs w:val="21"/>
+        </w:rPr>
+        <w:tab/>
       </w:r>
       <w:r>
         <w:rPr>
@@ -2791,7 +2891,7 @@
           <w:sz w:val="21"/>
           <w:szCs w:val="21"/>
         </w:rPr>
-        <w:t>Aug</w:t>
+        <w:t>August</w:t>
       </w:r>
       <w:r>
         <w:rPr>
@@ -2842,245 +2942,7 @@
           <w:sz w:val="21"/>
           <w:szCs w:val="21"/>
         </w:rPr>
-        <w:t>Deep</w:t>
-      </w:r>
-      <w:r>
-        <w:rPr>
-          <w:i/>
-          <w:color w:val="000000"/>
-          <w:sz w:val="21"/>
-          <w:szCs w:val="21"/>
-        </w:rPr>
-        <w:t xml:space="preserve"> </w:t>
-      </w:r>
-      <w:r>
-        <w:rPr>
-          <w:i/>
-          <w:noProof/>
-          <w:color w:val="000000"/>
-          <w:sz w:val="21"/>
-          <w:szCs w:val="21"/>
-        </w:rPr>
-        <w:t>Learning</w:t>
-      </w:r>
-      <w:r>
-        <w:rPr>
-          <w:i/>
-          <w:color w:val="000000"/>
-          <w:sz w:val="21"/>
-          <w:szCs w:val="21"/>
-        </w:rPr>
-        <w:t xml:space="preserve"> </w:t>
-      </w:r>
-      <w:r>
-        <w:rPr>
-          <w:i/>
-          <w:noProof/>
-          <w:color w:val="000000"/>
-          <w:sz w:val="21"/>
-          <w:szCs w:val="21"/>
-        </w:rPr>
-        <w:t>Engineer</w:t>
-      </w:r>
-      <w:r>
-        <w:rPr>
-          <w:i/>
-          <w:color w:val="000000"/>
-          <w:sz w:val="21"/>
-          <w:szCs w:val="21"/>
-        </w:rPr>
-        <w:t xml:space="preserve"> </w:t>
-      </w:r>
-      <w:r>
-        <w:rPr>
-          <w:i/>
-          <w:noProof/>
-          <w:color w:val="000000"/>
-          <w:sz w:val="21"/>
-          <w:szCs w:val="21"/>
-        </w:rPr>
-        <w:t>Intern</w:t>
-      </w:r>
-      <w:r>
-        <w:rPr>
-          <w:i/>
-          <w:color w:val="000000"/>
-          <w:spacing w:val="-1"/>
-          <w:sz w:val="21"/>
-          <w:szCs w:val="21"/>
-        </w:rPr>
-        <w:t xml:space="preserve"> </w:t>
-      </w:r>
-      <w:r>
-        <w:rPr>
-          <w:i/>
-          <w:noProof/>
-          <w:color w:val="000000"/>
-          <w:spacing w:val="1"/>
-          <w:sz w:val="21"/>
-          <w:szCs w:val="21"/>
-        </w:rPr>
-        <w:t>-</w:t>
-      </w:r>
-      <w:r>
-        <w:rPr>
-          <w:i/>
-          <w:color w:val="000000"/>
-          <w:spacing w:val="-1"/>
-          <w:sz w:val="21"/>
-          <w:szCs w:val="21"/>
-        </w:rPr>
-        <w:t xml:space="preserve"> </w:t>
-      </w:r>
-      <w:r>
-        <w:rPr>
-          <w:i/>
-          <w:noProof/>
-          <w:color w:val="000000"/>
-          <w:sz w:val="21"/>
-          <w:szCs w:val="21"/>
-        </w:rPr>
-        <w:t>LLM</w:t>
-      </w:r>
-      <w:r>
-        <w:rPr>
-          <w:i/>
-          <w:color w:val="000000"/>
-          <w:spacing w:val="-1"/>
-          <w:sz w:val="21"/>
-          <w:szCs w:val="21"/>
-        </w:rPr>
-        <w:t xml:space="preserve"> </w:t>
-      </w:r>
-      <w:r>
-        <w:rPr>
-          <w:i/>
-          <w:noProof/>
-          <w:color w:val="000000"/>
-          <w:sz w:val="21"/>
-          <w:szCs w:val="21"/>
-        </w:rPr>
-        <w:t>Research</w:t>
-      </w:r>
-      <w:r>
-        <w:rPr>
-          <w:i/>
-          <w:color w:val="000000"/>
-          <w:spacing w:val="-1"/>
-          <w:sz w:val="21"/>
-          <w:szCs w:val="21"/>
-        </w:rPr>
-        <w:t xml:space="preserve"> </w:t>
-      </w:r>
-      <w:r>
-        <w:rPr>
-          <w:i/>
-          <w:noProof/>
-          <w:color w:val="000000"/>
-          <w:sz w:val="21"/>
-          <w:szCs w:val="21"/>
-        </w:rPr>
-        <w:t>and</w:t>
-      </w:r>
-      <w:r>
-        <w:rPr>
-          <w:i/>
-          <w:color w:val="000000"/>
-          <w:spacing w:val="-1"/>
-          <w:sz w:val="21"/>
-          <w:szCs w:val="21"/>
-        </w:rPr>
-        <w:t xml:space="preserve"> </w:t>
-      </w:r>
-      <w:r>
-        <w:rPr>
-          <w:i/>
-          <w:noProof/>
-          <w:color w:val="000000"/>
-          <w:sz w:val="21"/>
-          <w:szCs w:val="21"/>
-        </w:rPr>
-        <w:t>Model</w:t>
-      </w:r>
-      <w:r>
-        <w:rPr>
-          <w:i/>
-          <w:color w:val="000000"/>
-          <w:spacing w:val="-1"/>
-          <w:sz w:val="21"/>
-          <w:szCs w:val="21"/>
-        </w:rPr>
-        <w:t xml:space="preserve"> </w:t>
-      </w:r>
-      <w:r>
-        <w:rPr>
-          <w:i/>
-          <w:noProof/>
-          <w:color w:val="000000"/>
-          <w:sz w:val="21"/>
-          <w:szCs w:val="21"/>
-        </w:rPr>
-        <w:t>safety</w:t>
-      </w:r>
-      <w:r>
-        <w:rPr>
-          <w:i/>
-          <w:color w:val="000000"/>
-          <w:spacing w:val="4076"/>
-          <w:sz w:val="21"/>
-          <w:szCs w:val="21"/>
-        </w:rPr>
-        <w:t xml:space="preserve"> </w:t>
-      </w:r>
-      <w:r>
-        <w:rPr>
-          <w:i/>
-          <w:noProof/>
-          <w:color w:val="000000"/>
-          <w:sz w:val="21"/>
-          <w:szCs w:val="21"/>
-        </w:rPr>
-        <w:t>San</w:t>
-      </w:r>
-      <w:r>
-        <w:rPr>
-          <w:i/>
-          <w:color w:val="000000"/>
-          <w:spacing w:val="-1"/>
-          <w:sz w:val="21"/>
-          <w:szCs w:val="21"/>
-        </w:rPr>
-        <w:t xml:space="preserve"> </w:t>
-      </w:r>
-      <w:r>
-        <w:rPr>
-          <w:i/>
-          <w:noProof/>
-          <w:color w:val="000000"/>
-          <w:sz w:val="21"/>
-          <w:szCs w:val="21"/>
-        </w:rPr>
-        <w:t>Jose,</w:t>
-      </w:r>
-      <w:r>
-        <w:rPr>
-          <w:i/>
-          <w:color w:val="000000"/>
-          <w:spacing w:val="-1"/>
-          <w:sz w:val="21"/>
-          <w:szCs w:val="21"/>
-        </w:rPr>
-        <w:t xml:space="preserve"> </w:t>
-      </w:r>
-      <w:r>
-        <w:rPr>
-          <w:i/>
-          <w:noProof/>
-          <w:color w:val="000000"/>
-          <w:sz w:val="21"/>
-          <w:szCs w:val="21"/>
-        </w:rPr>
-        <w:t>CA</w:t>
+        <w:t>Deep Learning Engineer Intern - AI Firewall Team San Jose, CA</w:t>
       </w:r>
     </w:p>
     <w:p>
@@ -3103,530 +2965,7 @@
           <w:noProof/>
           <w:color w:val="000000"/>
         </w:rPr>
-        <w:t>Developed</w:t>
-      </w:r>
-      <w:r>
-        <w:rPr>
-          <w:color w:val="000000"/>
-          <w:spacing w:val="-1"/>
-        </w:rPr>
-        <w:t xml:space="preserve"> </w:t>
-      </w:r>
-      <w:r>
-        <w:rPr>
-          <w:noProof/>
-          <w:color w:val="000000"/>
-        </w:rPr>
-        <w:t>a</w:t>
-      </w:r>
-      <w:r>
-        <w:rPr>
-          <w:color w:val="000000"/>
-          <w:spacing w:val="-1"/>
-        </w:rPr>
-        <w:t xml:space="preserve"> </w:t>
-      </w:r>
-      <w:r>
-        <w:rPr>
-          <w:noProof/>
-          <w:color w:val="000000"/>
-        </w:rPr>
-        <w:t>multimodal</w:t>
-      </w:r>
-      <w:r>
-        <w:rPr>
-          <w:color w:val="000000"/>
-          <w:spacing w:val="-1"/>
-        </w:rPr>
-        <w:t xml:space="preserve"> </w:t>
-      </w:r>
-      <w:r>
-        <w:rPr>
-          <w:noProof/>
-          <w:color w:val="000000"/>
-        </w:rPr>
-        <w:t>input/output</w:t>
-      </w:r>
-      <w:r>
-        <w:rPr>
-          <w:color w:val="000000"/>
-          <w:spacing w:val="-1"/>
-        </w:rPr>
-        <w:t xml:space="preserve"> </w:t>
-      </w:r>
-      <w:r>
-        <w:rPr>
-          <w:noProof/>
-          <w:color w:val="000000"/>
-        </w:rPr>
-        <w:t>guardrail</w:t>
-      </w:r>
-      <w:r>
-        <w:rPr>
-          <w:color w:val="000000"/>
-          <w:spacing w:val="-1"/>
-        </w:rPr>
-        <w:t xml:space="preserve"> </w:t>
-      </w:r>
-      <w:r>
-        <w:rPr>
-          <w:noProof/>
-          <w:color w:val="000000"/>
-        </w:rPr>
-        <w:t>system</w:t>
-      </w:r>
-      <w:r>
-        <w:rPr>
-          <w:color w:val="000000"/>
-          <w:spacing w:val="-1"/>
-        </w:rPr>
-        <w:t xml:space="preserve"> </w:t>
-      </w:r>
-      <w:r>
-        <w:rPr>
-          <w:noProof/>
-          <w:color w:val="000000"/>
-        </w:rPr>
-        <w:t>for</w:t>
-      </w:r>
-      <w:r>
-        <w:rPr>
-          <w:color w:val="000000"/>
-          <w:spacing w:val="-1"/>
-        </w:rPr>
-        <w:t xml:space="preserve"> </w:t>
-      </w:r>
-      <w:r>
-        <w:rPr>
-          <w:noProof/>
-          <w:color w:val="000000"/>
-        </w:rPr>
-        <w:t>VLM-powered</w:t>
-      </w:r>
-      <w:r>
-        <w:rPr>
-          <w:color w:val="000000"/>
-          <w:spacing w:val="-1"/>
-        </w:rPr>
-        <w:t xml:space="preserve"> </w:t>
-      </w:r>
-      <w:r>
-        <w:rPr>
-          <w:noProof/>
-          <w:color w:val="000000"/>
-        </w:rPr>
-        <w:t>applications,</w:t>
-      </w:r>
-      <w:r>
-        <w:rPr>
-          <w:color w:val="000000"/>
-          <w:spacing w:val="-1"/>
-        </w:rPr>
-        <w:t xml:space="preserve"> </w:t>
-      </w:r>
-      <w:r>
-        <w:rPr>
-          <w:noProof/>
-          <w:color w:val="000000"/>
-        </w:rPr>
-        <w:t>fine-tuning</w:t>
-      </w:r>
-      <w:r>
-        <w:rPr>
-          <w:color w:val="000000"/>
-          <w:spacing w:val="-1"/>
-        </w:rPr>
-        <w:t xml:space="preserve"> </w:t>
-      </w:r>
-      <w:r>
-        <w:rPr>
-          <w:noProof/>
-          <w:color w:val="000000"/>
-        </w:rPr>
-        <w:t>a</w:t>
-      </w:r>
-      <w:r>
-        <w:rPr>
-          <w:color w:val="000000"/>
-          <w:spacing w:val="-1"/>
-        </w:rPr>
-        <w:t xml:space="preserve"> </w:t>
-      </w:r>
-      <w:r>
-        <w:rPr>
-          <w:noProof/>
-          <w:color w:val="000000"/>
-        </w:rPr>
-        <w:t>compact</w:t>
-      </w:r>
-      <w:r>
-        <w:rPr>
-          <w:color w:val="000000"/>
-          <w:spacing w:val="-1"/>
-        </w:rPr>
-        <w:t xml:space="preserve"> </w:t>
-      </w:r>
-      <w:r>
-        <w:rPr>
-          <w:noProof/>
-          <w:color w:val="000000"/>
-        </w:rPr>
-        <w:t>language</w:t>
-      </w:r>
-      <w:r>
-        <w:rPr>
-          <w:color w:val="000000"/>
-          <w:spacing w:val="-1"/>
-        </w:rPr>
-        <w:t xml:space="preserve"> </w:t>
-      </w:r>
-      <w:r>
-        <w:rPr>
-          <w:noProof/>
-          <w:color w:val="000000"/>
-        </w:rPr>
-        <w:t>model</w:t>
-      </w:r>
-      <w:r>
-        <w:rPr>
-          <w:color w:val="000000"/>
-          <w:spacing w:val="-1"/>
-        </w:rPr>
-        <w:t xml:space="preserve"> </w:t>
-      </w:r>
-      <w:r>
-        <w:rPr>
-          <w:noProof/>
-          <w:color w:val="000000"/>
-        </w:rPr>
-        <w:t>with</w:t>
-      </w:r>
-      <w:r>
-        <w:rPr>
-          <w:color w:val="000000"/>
-        </w:rPr>
-        <w:t xml:space="preserve"> </w:t>
-      </w:r>
-      <w:r>
-        <w:rPr>
-          <w:noProof/>
-          <w:color w:val="000000"/>
-        </w:rPr>
-        <w:t>SFT</w:t>
-      </w:r>
-      <w:r>
-        <w:rPr>
-          <w:color w:val="000000"/>
-          <w:spacing w:val="-1"/>
-        </w:rPr>
-        <w:t xml:space="preserve"> </w:t>
-      </w:r>
-      <w:r>
-        <w:rPr>
-          <w:noProof/>
-          <w:color w:val="000000"/>
-        </w:rPr>
-        <w:t>and</w:t>
-      </w:r>
-      <w:r>
-        <w:rPr>
-          <w:color w:val="000000"/>
-          <w:spacing w:val="-1"/>
-        </w:rPr>
-        <w:t xml:space="preserve"> </w:t>
-      </w:r>
-      <w:r>
-        <w:rPr>
-          <w:noProof/>
-          <w:color w:val="000000"/>
-        </w:rPr>
-        <w:t>chain-of-thought</w:t>
-      </w:r>
-      <w:r>
-        <w:rPr>
-          <w:color w:val="000000"/>
-          <w:spacing w:val="-1"/>
-        </w:rPr>
-        <w:t xml:space="preserve"> </w:t>
-      </w:r>
-      <w:r>
-        <w:rPr>
-          <w:noProof/>
-          <w:color w:val="000000"/>
-        </w:rPr>
-        <w:t>rationales</w:t>
-      </w:r>
-      <w:r>
-        <w:rPr>
-          <w:color w:val="000000"/>
-          <w:spacing w:val="-1"/>
-        </w:rPr>
-        <w:t xml:space="preserve"> </w:t>
-      </w:r>
-      <w:r>
-        <w:rPr>
-          <w:noProof/>
-          <w:color w:val="000000"/>
-        </w:rPr>
-        <w:t>-</w:t>
-      </w:r>
-      <w:r>
-        <w:rPr>
-          <w:color w:val="000000"/>
-          <w:spacing w:val="-1"/>
-        </w:rPr>
-        <w:t xml:space="preserve"> </w:t>
-      </w:r>
-      <w:r>
-        <w:rPr>
-          <w:noProof/>
-          <w:color w:val="000000"/>
-        </w:rPr>
-        <w:t>serving</w:t>
-      </w:r>
-      <w:r>
-        <w:rPr>
-          <w:color w:val="000000"/>
-          <w:spacing w:val="-1"/>
-        </w:rPr>
-        <w:t xml:space="preserve"> </w:t>
-      </w:r>
-      <w:r>
-        <w:rPr>
-          <w:noProof/>
-          <w:color w:val="000000"/>
-        </w:rPr>
-        <w:t>sub-200ms</w:t>
-      </w:r>
-      <w:r>
-        <w:rPr>
-          <w:color w:val="000000"/>
-          <w:spacing w:val="-1"/>
-        </w:rPr>
-        <w:t xml:space="preserve"> </w:t>
-      </w:r>
-      <w:r>
-        <w:rPr>
-          <w:noProof/>
-          <w:color w:val="000000"/>
-        </w:rPr>
-        <w:t>inference</w:t>
-      </w:r>
-      <w:r>
-        <w:rPr>
-          <w:color w:val="000000"/>
-          <w:spacing w:val="-1"/>
-        </w:rPr>
-        <w:t xml:space="preserve"> </w:t>
-      </w:r>
-      <w:r>
-        <w:rPr>
-          <w:noProof/>
-          <w:color w:val="000000"/>
-        </w:rPr>
-        <w:t>on</w:t>
-      </w:r>
-      <w:r>
-        <w:rPr>
-          <w:color w:val="000000"/>
-          <w:spacing w:val="-1"/>
-        </w:rPr>
-        <w:t xml:space="preserve"> </w:t>
-      </w:r>
-      <w:r>
-        <w:rPr>
-          <w:noProof/>
-          <w:color w:val="000000"/>
-        </w:rPr>
-        <w:t>Hopper</w:t>
-      </w:r>
-      <w:r>
-        <w:rPr>
-          <w:color w:val="000000"/>
-          <w:spacing w:val="-1"/>
-        </w:rPr>
-        <w:t xml:space="preserve"> </w:t>
-      </w:r>
-      <w:r>
-        <w:rPr>
-          <w:noProof/>
-          <w:color w:val="000000"/>
-        </w:rPr>
-        <w:t>GPUs</w:t>
-      </w:r>
-      <w:r>
-        <w:rPr>
-          <w:color w:val="000000"/>
-          <w:spacing w:val="-1"/>
-        </w:rPr>
-        <w:t xml:space="preserve"> </w:t>
-      </w:r>
-      <w:r>
-        <w:rPr>
-          <w:noProof/>
-          <w:color w:val="000000"/>
-        </w:rPr>
-        <w:t>via</w:t>
-      </w:r>
-      <w:r>
-        <w:rPr>
-          <w:color w:val="000000"/>
-          <w:spacing w:val="-1"/>
-        </w:rPr>
-        <w:t xml:space="preserve"> </w:t>
-      </w:r>
-      <w:r>
-        <w:rPr>
-          <w:noProof/>
-          <w:color w:val="000000"/>
-        </w:rPr>
-        <w:t>vLLM</w:t>
-      </w:r>
-      <w:r>
-        <w:rPr>
-          <w:color w:val="000000"/>
-          <w:spacing w:val="-1"/>
-        </w:rPr>
-        <w:t xml:space="preserve"> </w:t>
-      </w:r>
-      <w:r>
-        <w:rPr>
-          <w:noProof/>
-          <w:color w:val="000000"/>
-        </w:rPr>
-        <w:t>and</w:t>
-      </w:r>
-      <w:r>
-        <w:rPr>
-          <w:color w:val="000000"/>
-          <w:spacing w:val="-1"/>
-        </w:rPr>
-        <w:t xml:space="preserve"> </w:t>
-      </w:r>
-      <w:r>
-        <w:rPr>
-          <w:noProof/>
-          <w:color w:val="000000"/>
-        </w:rPr>
-        <w:t>outperforming</w:t>
-      </w:r>
-      <w:r>
-        <w:rPr>
-          <w:color w:val="000000"/>
-          <w:spacing w:val="-1"/>
-        </w:rPr>
-        <w:t xml:space="preserve"> </w:t>
-      </w:r>
-      <w:r>
-        <w:rPr>
-          <w:noProof/>
-          <w:color w:val="000000"/>
-        </w:rPr>
-        <w:t>leading</w:t>
-      </w:r>
-      <w:r>
-        <w:rPr>
-          <w:color w:val="000000"/>
-          <w:spacing w:val="-1"/>
-        </w:rPr>
-        <w:t xml:space="preserve"> </w:t>
-      </w:r>
-      <w:r>
-        <w:rPr>
-          <w:noProof/>
-          <w:color w:val="000000"/>
-        </w:rPr>
-        <w:t>public</w:t>
-      </w:r>
-      <w:r>
-        <w:rPr>
-          <w:color w:val="000000"/>
-          <w:spacing w:val="56"/>
-        </w:rPr>
-        <w:t xml:space="preserve"> </w:t>
-      </w:r>
-      <w:r>
-        <w:rPr>
-          <w:noProof/>
-          <w:color w:val="000000"/>
-        </w:rPr>
-        <w:t>guardrail</w:t>
-      </w:r>
-      <w:r>
-        <w:rPr>
-          <w:color w:val="000000"/>
-        </w:rPr>
-        <w:t xml:space="preserve"> </w:t>
-      </w:r>
-      <w:r>
-        <w:rPr>
-          <w:noProof/>
-          <w:color w:val="000000"/>
-        </w:rPr>
-        <w:t>benchmarks</w:t>
-      </w:r>
-      <w:r>
-        <w:rPr>
-          <w:color w:val="000000"/>
-          <w:spacing w:val="-1"/>
-        </w:rPr>
-        <w:t xml:space="preserve"> </w:t>
-      </w:r>
-      <w:r>
-        <w:rPr>
-          <w:noProof/>
-          <w:color w:val="000000"/>
-        </w:rPr>
-        <w:t>by</w:t>
-      </w:r>
-      <w:r>
-        <w:rPr>
-          <w:color w:val="000000"/>
-          <w:spacing w:val="-1"/>
-        </w:rPr>
-        <w:t xml:space="preserve"> </w:t>
-      </w:r>
-      <w:r>
-        <w:rPr>
-          <w:noProof/>
-          <w:color w:val="000000"/>
-          <w:spacing w:val="1"/>
-        </w:rPr>
-        <w:t>a</w:t>
-      </w:r>
-      <w:r>
-        <w:rPr>
-          <w:color w:val="000000"/>
-          <w:spacing w:val="-1"/>
-        </w:rPr>
-        <w:t xml:space="preserve"> </w:t>
-      </w:r>
-      <w:r>
-        <w:rPr>
-          <w:noProof/>
-          <w:color w:val="000000"/>
-        </w:rPr>
-        <w:t>wide</w:t>
-      </w:r>
-      <w:r>
-        <w:rPr>
-          <w:color w:val="000000"/>
-          <w:spacing w:val="-1"/>
-        </w:rPr>
-        <w:t xml:space="preserve"> </w:t>
-      </w:r>
-      <w:r>
-        <w:rPr>
-          <w:noProof/>
-          <w:color w:val="000000"/>
-        </w:rPr>
-        <w:t>margin.</w:t>
-      </w:r>
-      <w:r>
-        <w:rPr>
-          <w:color w:val="000000"/>
-        </w:rPr>
-        <w:t xml:space="preserve"> </w:t>
+        <w:t>Developed a multimodal input/output guardrail system for VLM-powered applications, fine-tuning a compact language model with SFT and chain-of-thought rationales and serving production inference on Hopper GPUs via vLLM.</w:t>
       </w:r>
     </w:p>
     <w:p>
@@ -3648,474 +2987,7 @@
           <w:noProof/>
           <w:color w:val="000000"/>
         </w:rPr>
-        <w:t>Built</w:t>
-      </w:r>
-      <w:r>
-        <w:rPr>
-          <w:color w:val="000000"/>
-          <w:w w:val="74"/>
-        </w:rPr>
-        <w:t xml:space="preserve"> </w:t>
-      </w:r>
-      <w:r>
-        <w:rPr>
-          <w:noProof/>
-          <w:color w:val="000000"/>
-        </w:rPr>
-        <w:t>a</w:t>
-      </w:r>
-      <w:r>
-        <w:rPr>
-          <w:color w:val="000000"/>
-          <w:w w:val="74"/>
-        </w:rPr>
-        <w:t xml:space="preserve"> </w:t>
-      </w:r>
-      <w:r>
-        <w:rPr>
-          <w:noProof/>
-          <w:color w:val="000000"/>
-        </w:rPr>
-        <w:t>custom</w:t>
-      </w:r>
-      <w:r>
-        <w:rPr>
-          <w:color w:val="000000"/>
-          <w:w w:val="74"/>
-        </w:rPr>
-        <w:t xml:space="preserve"> </w:t>
-      </w:r>
-      <w:r>
-        <w:rPr>
-          <w:noProof/>
-          <w:color w:val="000000"/>
-        </w:rPr>
-        <w:t>multi-stage</w:t>
-      </w:r>
-      <w:r>
-        <w:rPr>
-          <w:color w:val="000000"/>
-          <w:w w:val="74"/>
-        </w:rPr>
-        <w:t xml:space="preserve"> </w:t>
-      </w:r>
-      <w:r>
-        <w:rPr>
-          <w:noProof/>
-          <w:color w:val="000000"/>
-        </w:rPr>
-        <w:t>data</w:t>
-      </w:r>
-      <w:r>
-        <w:rPr>
-          <w:color w:val="000000"/>
-          <w:w w:val="74"/>
-        </w:rPr>
-        <w:t xml:space="preserve"> </w:t>
-      </w:r>
-      <w:r>
-        <w:rPr>
-          <w:noProof/>
-          <w:color w:val="000000"/>
-        </w:rPr>
-        <w:t>annotation</w:t>
-      </w:r>
-      <w:r>
-        <w:rPr>
-          <w:color w:val="000000"/>
-          <w:w w:val="74"/>
-        </w:rPr>
-        <w:t xml:space="preserve"> </w:t>
-      </w:r>
-      <w:r>
-        <w:rPr>
-          <w:noProof/>
-          <w:color w:val="000000"/>
-        </w:rPr>
-        <w:t>and</w:t>
-      </w:r>
-      <w:r>
-        <w:rPr>
-          <w:color w:val="000000"/>
-          <w:w w:val="74"/>
-        </w:rPr>
-        <w:t xml:space="preserve"> </w:t>
-      </w:r>
-      <w:r>
-        <w:rPr>
-          <w:noProof/>
-          <w:color w:val="000000"/>
-        </w:rPr>
-        <w:t>verification</w:t>
-      </w:r>
-      <w:r>
-        <w:rPr>
-          <w:color w:val="000000"/>
-          <w:w w:val="74"/>
-        </w:rPr>
-        <w:t xml:space="preserve"> </w:t>
-      </w:r>
-      <w:r>
-        <w:rPr>
-          <w:noProof/>
-          <w:color w:val="000000"/>
-        </w:rPr>
-        <w:t>pipeline</w:t>
-      </w:r>
-      <w:r>
-        <w:rPr>
-          <w:color w:val="000000"/>
-          <w:w w:val="74"/>
-        </w:rPr>
-        <w:t xml:space="preserve"> </w:t>
-      </w:r>
-      <w:r>
-        <w:rPr>
-          <w:noProof/>
-          <w:color w:val="000000"/>
-        </w:rPr>
-        <w:t>to</w:t>
-      </w:r>
-      <w:r>
-        <w:rPr>
-          <w:color w:val="000000"/>
-          <w:w w:val="74"/>
-        </w:rPr>
-        <w:t xml:space="preserve"> </w:t>
-      </w:r>
-      <w:r>
-        <w:rPr>
-          <w:noProof/>
-          <w:color w:val="000000"/>
-        </w:rPr>
-        <w:t>overcome</w:t>
-      </w:r>
-      <w:r>
-        <w:rPr>
-          <w:color w:val="000000"/>
-          <w:w w:val="74"/>
-        </w:rPr>
-        <w:t xml:space="preserve"> </w:t>
-      </w:r>
-      <w:r>
-        <w:rPr>
-          <w:noProof/>
-          <w:color w:val="000000"/>
-        </w:rPr>
-        <w:t>the</w:t>
-      </w:r>
-      <w:r>
-        <w:rPr>
-          <w:color w:val="000000"/>
-          <w:w w:val="74"/>
-        </w:rPr>
-        <w:t xml:space="preserve"> </w:t>
-      </w:r>
-      <w:r>
-        <w:rPr>
-          <w:noProof/>
-          <w:color w:val="000000"/>
-        </w:rPr>
-        <w:t>scarcity</w:t>
-      </w:r>
-      <w:r>
-        <w:rPr>
-          <w:color w:val="000000"/>
-          <w:w w:val="74"/>
-        </w:rPr>
-        <w:t xml:space="preserve"> </w:t>
-      </w:r>
-      <w:r>
-        <w:rPr>
-          <w:noProof/>
-          <w:color w:val="000000"/>
-        </w:rPr>
-        <w:t>and</w:t>
-      </w:r>
-      <w:r>
-        <w:rPr>
-          <w:color w:val="000000"/>
-          <w:w w:val="74"/>
-        </w:rPr>
-        <w:t xml:space="preserve"> </w:t>
-      </w:r>
-      <w:r>
-        <w:rPr>
-          <w:noProof/>
-          <w:color w:val="000000"/>
-        </w:rPr>
-        <w:t>noise</w:t>
-      </w:r>
-      <w:r>
-        <w:rPr>
-          <w:color w:val="000000"/>
-          <w:w w:val="74"/>
-        </w:rPr>
-        <w:t xml:space="preserve"> </w:t>
-      </w:r>
-      <w:r>
-        <w:rPr>
-          <w:noProof/>
-          <w:color w:val="000000"/>
-        </w:rPr>
-        <w:t>of</w:t>
-      </w:r>
-      <w:r>
-        <w:rPr>
-          <w:color w:val="000000"/>
-          <w:w w:val="74"/>
-        </w:rPr>
-        <w:t xml:space="preserve"> </w:t>
-      </w:r>
-      <w:r>
-        <w:rPr>
-          <w:noProof/>
-          <w:color w:val="000000"/>
-        </w:rPr>
-        <w:t>publicly</w:t>
-      </w:r>
-      <w:r>
-        <w:rPr>
-          <w:color w:val="000000"/>
-          <w:w w:val="74"/>
-        </w:rPr>
-        <w:t xml:space="preserve"> </w:t>
-      </w:r>
-      <w:r>
-        <w:rPr>
-          <w:noProof/>
-          <w:color w:val="000000"/>
-        </w:rPr>
-        <w:t>available</w:t>
-      </w:r>
-      <w:r>
-        <w:rPr>
-          <w:color w:val="000000"/>
-          <w:w w:val="74"/>
-        </w:rPr>
-        <w:t xml:space="preserve"> </w:t>
-      </w:r>
-      <w:r>
-        <w:rPr>
-          <w:noProof/>
-          <w:color w:val="000000"/>
-        </w:rPr>
-        <w:t>multimodal</w:t>
-      </w:r>
-      <w:r>
-        <w:rPr>
-          <w:color w:val="000000"/>
-        </w:rPr>
-        <w:t xml:space="preserve"> </w:t>
-      </w:r>
-      <w:r>
-        <w:rPr>
-          <w:noProof/>
-          <w:color w:val="000000"/>
-        </w:rPr>
-        <w:t>safety</w:t>
-      </w:r>
-      <w:r>
-        <w:rPr>
-          <w:color w:val="000000"/>
-          <w:w w:val="84"/>
-        </w:rPr>
-        <w:t xml:space="preserve"> </w:t>
-      </w:r>
-      <w:r>
-        <w:rPr>
-          <w:noProof/>
-          <w:color w:val="000000"/>
-        </w:rPr>
-        <w:t>datasets,</w:t>
-      </w:r>
-      <w:r>
-        <w:rPr>
-          <w:color w:val="000000"/>
-          <w:w w:val="84"/>
-        </w:rPr>
-        <w:t xml:space="preserve"> </w:t>
-      </w:r>
-      <w:r>
-        <w:rPr>
-          <w:noProof/>
-          <w:color w:val="000000"/>
-        </w:rPr>
-        <w:t>producing</w:t>
-      </w:r>
-      <w:r>
-        <w:rPr>
-          <w:color w:val="000000"/>
-          <w:w w:val="84"/>
-        </w:rPr>
-        <w:t xml:space="preserve"> </w:t>
-      </w:r>
-      <w:r>
-        <w:rPr>
-          <w:noProof/>
-          <w:color w:val="000000"/>
-        </w:rPr>
-        <w:t>a</w:t>
-      </w:r>
-      <w:r>
-        <w:rPr>
-          <w:color w:val="000000"/>
-          <w:w w:val="84"/>
-        </w:rPr>
-        <w:t xml:space="preserve"> </w:t>
-      </w:r>
-      <w:r>
-        <w:rPr>
-          <w:noProof/>
-          <w:color w:val="000000"/>
-        </w:rPr>
-        <w:t>curated</w:t>
-      </w:r>
-      <w:r>
-        <w:rPr>
-          <w:color w:val="000000"/>
-          <w:w w:val="84"/>
-        </w:rPr>
-        <w:t xml:space="preserve"> </w:t>
-      </w:r>
-      <w:r>
-        <w:rPr>
-          <w:noProof/>
-          <w:color w:val="000000"/>
-        </w:rPr>
-        <w:t>training</w:t>
-      </w:r>
-      <w:r>
-        <w:rPr>
-          <w:color w:val="000000"/>
-          <w:w w:val="84"/>
-        </w:rPr>
-        <w:t xml:space="preserve"> </w:t>
-      </w:r>
-      <w:r>
-        <w:rPr>
-          <w:noProof/>
-          <w:color w:val="000000"/>
-        </w:rPr>
-        <w:t>corpus</w:t>
-      </w:r>
-      <w:r>
-        <w:rPr>
-          <w:color w:val="000000"/>
-          <w:w w:val="84"/>
-        </w:rPr>
-        <w:t xml:space="preserve"> </w:t>
-      </w:r>
-      <w:r>
-        <w:rPr>
-          <w:noProof/>
-          <w:color w:val="000000"/>
-        </w:rPr>
-        <w:t>with</w:t>
-      </w:r>
-      <w:r>
-        <w:rPr>
-          <w:color w:val="000000"/>
-          <w:w w:val="84"/>
-        </w:rPr>
-        <w:t xml:space="preserve"> </w:t>
-      </w:r>
-      <w:r>
-        <w:rPr>
-          <w:noProof/>
-          <w:color w:val="000000"/>
-        </w:rPr>
-        <w:t>inter-annotator</w:t>
-      </w:r>
-      <w:r>
-        <w:rPr>
-          <w:color w:val="000000"/>
-          <w:w w:val="84"/>
-        </w:rPr>
-        <w:t xml:space="preserve"> </w:t>
-      </w:r>
-      <w:r>
-        <w:rPr>
-          <w:noProof/>
-          <w:color w:val="000000"/>
-        </w:rPr>
-        <w:t>agreement</w:t>
-      </w:r>
-      <w:r>
-        <w:rPr>
-          <w:color w:val="000000"/>
-          <w:w w:val="84"/>
-        </w:rPr>
-        <w:t xml:space="preserve"> </w:t>
-      </w:r>
-      <w:r>
-        <w:rPr>
-          <w:noProof/>
-          <w:color w:val="000000"/>
-        </w:rPr>
-        <w:t>metrics</w:t>
-      </w:r>
-      <w:r>
-        <w:rPr>
-          <w:color w:val="000000"/>
-          <w:w w:val="84"/>
-        </w:rPr>
-        <w:t xml:space="preserve"> </w:t>
-      </w:r>
-      <w:r>
-        <w:rPr>
-          <w:noProof/>
-          <w:color w:val="000000"/>
-        </w:rPr>
-        <w:t>and</w:t>
-      </w:r>
-      <w:r>
-        <w:rPr>
-          <w:color w:val="000000"/>
-          <w:w w:val="84"/>
-        </w:rPr>
-        <w:t xml:space="preserve"> </w:t>
-      </w:r>
-      <w:r>
-        <w:rPr>
-          <w:noProof/>
-          <w:color w:val="000000"/>
-        </w:rPr>
-        <w:t>automated</w:t>
-      </w:r>
-      <w:r>
-        <w:rPr>
-          <w:color w:val="000000"/>
-          <w:w w:val="84"/>
-        </w:rPr>
-        <w:t xml:space="preserve"> </w:t>
-      </w:r>
-      <w:r>
-        <w:rPr>
-          <w:noProof/>
-          <w:color w:val="000000"/>
-        </w:rPr>
-        <w:t>quality</w:t>
-      </w:r>
-      <w:r>
-        <w:rPr>
-          <w:color w:val="000000"/>
-          <w:w w:val="84"/>
-        </w:rPr>
-        <w:t xml:space="preserve"> </w:t>
-      </w:r>
-      <w:r>
-        <w:rPr>
-          <w:noProof/>
-          <w:color w:val="000000"/>
-        </w:rPr>
-        <w:t>filtering.</w:t>
-      </w:r>
-      <w:r>
-        <w:rPr>
-          <w:color w:val="000000"/>
-        </w:rPr>
-        <w:t xml:space="preserve"> </w:t>
+        <w:t>Built a custom data annotation and verification pipeline to overcome the scarcity and noise of publicly available multimodal safety datasets, producing a curated training corpus with inter-annotator agreement metrics and automated quality filtering.</w:t>
       </w:r>
     </w:p>
     <w:p>
@@ -4137,390 +3009,7 @@
           <w:noProof/>
           <w:color w:val="000000"/>
         </w:rPr>
-        <w:t>Designed</w:t>
-      </w:r>
-      <w:r>
-        <w:rPr>
-          <w:color w:val="000000"/>
-          <w:w w:val="92"/>
-        </w:rPr>
-        <w:t xml:space="preserve"> </w:t>
-      </w:r>
-      <w:r>
-        <w:rPr>
-          <w:noProof/>
-          <w:color w:val="000000"/>
-        </w:rPr>
-        <w:t>a</w:t>
-      </w:r>
-      <w:r>
-        <w:rPr>
-          <w:color w:val="000000"/>
-          <w:w w:val="92"/>
-        </w:rPr>
-        <w:t xml:space="preserve"> </w:t>
-      </w:r>
-      <w:r>
-        <w:rPr>
-          <w:noProof/>
-          <w:color w:val="000000"/>
-        </w:rPr>
-        <w:t>systematic</w:t>
-      </w:r>
-      <w:r>
-        <w:rPr>
-          <w:color w:val="000000"/>
-          <w:w w:val="92"/>
-        </w:rPr>
-        <w:t xml:space="preserve"> </w:t>
-      </w:r>
-      <w:r>
-        <w:rPr>
-          <w:noProof/>
-          <w:color w:val="000000"/>
-        </w:rPr>
-        <w:t>evaluation</w:t>
-      </w:r>
-      <w:r>
-        <w:rPr>
-          <w:color w:val="000000"/>
-          <w:w w:val="92"/>
-        </w:rPr>
-        <w:t xml:space="preserve"> </w:t>
-      </w:r>
-      <w:r>
-        <w:rPr>
-          <w:noProof/>
-          <w:color w:val="000000"/>
-        </w:rPr>
-        <w:t>framework</w:t>
-      </w:r>
-      <w:r>
-        <w:rPr>
-          <w:color w:val="000000"/>
-          <w:w w:val="92"/>
-        </w:rPr>
-        <w:t xml:space="preserve"> </w:t>
-      </w:r>
-      <w:r>
-        <w:rPr>
-          <w:noProof/>
-          <w:color w:val="000000"/>
-        </w:rPr>
-        <w:t>with</w:t>
-      </w:r>
-      <w:r>
-        <w:rPr>
-          <w:color w:val="000000"/>
-          <w:w w:val="92"/>
-        </w:rPr>
-        <w:t xml:space="preserve"> </w:t>
-      </w:r>
-      <w:r>
-        <w:rPr>
-          <w:noProof/>
-          <w:color w:val="000000"/>
-        </w:rPr>
-        <w:t>false-negative-rate</w:t>
-      </w:r>
-      <w:r>
-        <w:rPr>
-          <w:color w:val="000000"/>
-          <w:w w:val="92"/>
-        </w:rPr>
-        <w:t xml:space="preserve"> </w:t>
-      </w:r>
-      <w:r>
-        <w:rPr>
-          <w:noProof/>
-          <w:color w:val="000000"/>
-        </w:rPr>
-        <w:t>diagnostics</w:t>
-      </w:r>
-      <w:r>
-        <w:rPr>
-          <w:color w:val="000000"/>
-          <w:w w:val="92"/>
-        </w:rPr>
-        <w:t xml:space="preserve"> </w:t>
-      </w:r>
-      <w:r>
-        <w:rPr>
-          <w:noProof/>
-          <w:color w:val="000000"/>
-        </w:rPr>
-        <w:t>across</w:t>
-      </w:r>
-      <w:r>
-        <w:rPr>
-          <w:color w:val="000000"/>
-          <w:w w:val="92"/>
-        </w:rPr>
-        <w:t xml:space="preserve"> </w:t>
-      </w:r>
-      <w:r>
-        <w:rPr>
-          <w:noProof/>
-          <w:color w:val="000000"/>
-        </w:rPr>
-        <w:t>safety</w:t>
-      </w:r>
-      <w:r>
-        <w:rPr>
-          <w:color w:val="000000"/>
-          <w:w w:val="92"/>
-        </w:rPr>
-        <w:t xml:space="preserve"> </w:t>
-      </w:r>
-      <w:r>
-        <w:rPr>
-          <w:noProof/>
-          <w:color w:val="000000"/>
-        </w:rPr>
-        <w:t>policy</w:t>
-      </w:r>
-      <w:r>
-        <w:rPr>
-          <w:color w:val="000000"/>
-          <w:w w:val="92"/>
-        </w:rPr>
-        <w:t xml:space="preserve"> </w:t>
-      </w:r>
-      <w:r>
-        <w:rPr>
-          <w:noProof/>
-          <w:color w:val="000000"/>
-        </w:rPr>
-        <w:t>categories,</w:t>
-      </w:r>
-      <w:r>
-        <w:rPr>
-          <w:color w:val="000000"/>
-          <w:w w:val="92"/>
-        </w:rPr>
-        <w:t xml:space="preserve"> </w:t>
-      </w:r>
-      <w:r>
-        <w:rPr>
-          <w:noProof/>
-          <w:color w:val="000000"/>
-        </w:rPr>
-        <w:t>collaborating</w:t>
-      </w:r>
-      <w:r>
-        <w:rPr>
-          <w:color w:val="000000"/>
-          <w:w w:val="92"/>
-        </w:rPr>
-        <w:t xml:space="preserve"> </w:t>
-      </w:r>
-      <w:r>
-        <w:rPr>
-          <w:noProof/>
-          <w:color w:val="000000"/>
-        </w:rPr>
-        <w:t>within</w:t>
-      </w:r>
-      <w:r>
-        <w:rPr>
-          <w:color w:val="000000"/>
-        </w:rPr>
-        <w:t xml:space="preserve"> </w:t>
-      </w:r>
-      <w:r>
-        <w:rPr>
-          <w:noProof/>
-          <w:color w:val="000000"/>
-        </w:rPr>
-        <w:t>a</w:t>
-      </w:r>
-      <w:r>
-        <w:rPr>
-          <w:color w:val="000000"/>
-          <w:w w:val="95"/>
-        </w:rPr>
-        <w:t xml:space="preserve"> </w:t>
-      </w:r>
-      <w:r>
-        <w:rPr>
-          <w:noProof/>
-          <w:color w:val="000000"/>
-        </w:rPr>
-        <w:t>3-person</w:t>
-      </w:r>
-      <w:r>
-        <w:rPr>
-          <w:color w:val="000000"/>
-          <w:w w:val="95"/>
-        </w:rPr>
-        <w:t xml:space="preserve"> </w:t>
-      </w:r>
-      <w:r>
-        <w:rPr>
-          <w:noProof/>
-          <w:color w:val="000000"/>
-        </w:rPr>
-        <w:t>AI</w:t>
-      </w:r>
-      <w:r>
-        <w:rPr>
-          <w:color w:val="000000"/>
-          <w:w w:val="95"/>
-        </w:rPr>
-        <w:t xml:space="preserve"> </w:t>
-      </w:r>
-      <w:r>
-        <w:rPr>
-          <w:noProof/>
-          <w:color w:val="000000"/>
-        </w:rPr>
-        <w:t>Security</w:t>
-      </w:r>
-      <w:r>
-        <w:rPr>
-          <w:color w:val="000000"/>
-          <w:w w:val="95"/>
-        </w:rPr>
-        <w:t xml:space="preserve"> </w:t>
-      </w:r>
-      <w:r>
-        <w:rPr>
-          <w:noProof/>
-          <w:color w:val="000000"/>
-        </w:rPr>
-        <w:t>team</w:t>
-      </w:r>
-      <w:r>
-        <w:rPr>
-          <w:color w:val="000000"/>
-          <w:w w:val="95"/>
-        </w:rPr>
-        <w:t xml:space="preserve"> </w:t>
-      </w:r>
-      <w:r>
-        <w:rPr>
-          <w:noProof/>
-          <w:color w:val="000000"/>
-        </w:rPr>
-        <w:t>with</w:t>
-      </w:r>
-      <w:r>
-        <w:rPr>
-          <w:color w:val="000000"/>
-          <w:w w:val="95"/>
-        </w:rPr>
-        <w:t xml:space="preserve"> </w:t>
-      </w:r>
-      <w:r>
-        <w:rPr>
-          <w:noProof/>
-          <w:color w:val="000000"/>
-        </w:rPr>
-        <w:t>weekly</w:t>
-      </w:r>
-      <w:r>
-        <w:rPr>
-          <w:color w:val="000000"/>
-          <w:w w:val="95"/>
-        </w:rPr>
-        <w:t xml:space="preserve"> </w:t>
-      </w:r>
-      <w:r>
-        <w:rPr>
-          <w:noProof/>
-          <w:color w:val="000000"/>
-        </w:rPr>
-        <w:t>syncs</w:t>
-      </w:r>
-      <w:r>
-        <w:rPr>
-          <w:color w:val="000000"/>
-          <w:w w:val="95"/>
-        </w:rPr>
-        <w:t xml:space="preserve"> </w:t>
-      </w:r>
-      <w:r>
-        <w:rPr>
-          <w:noProof/>
-          <w:color w:val="000000"/>
-        </w:rPr>
-        <w:t>and</w:t>
-      </w:r>
-      <w:r>
-        <w:rPr>
-          <w:color w:val="000000"/>
-          <w:w w:val="95"/>
-        </w:rPr>
-        <w:t xml:space="preserve"> </w:t>
-      </w:r>
-      <w:r>
-        <w:rPr>
-          <w:noProof/>
-          <w:color w:val="000000"/>
-        </w:rPr>
-        <w:t>Weights</w:t>
-      </w:r>
-      <w:r>
-        <w:rPr>
-          <w:color w:val="000000"/>
-          <w:w w:val="95"/>
-        </w:rPr>
-        <w:t xml:space="preserve"> </w:t>
-      </w:r>
-      <w:r>
-        <w:rPr>
-          <w:noProof/>
-          <w:color w:val="000000"/>
-        </w:rPr>
-        <w:t>&amp;</w:t>
-      </w:r>
-      <w:r>
-        <w:rPr>
-          <w:color w:val="000000"/>
-          <w:w w:val="95"/>
-        </w:rPr>
-        <w:t xml:space="preserve"> </w:t>
-      </w:r>
-      <w:r>
-        <w:rPr>
-          <w:noProof/>
-          <w:color w:val="000000"/>
-        </w:rPr>
-        <w:t>Biases</w:t>
-      </w:r>
-      <w:r>
-        <w:rPr>
-          <w:color w:val="000000"/>
-          <w:w w:val="95"/>
-        </w:rPr>
-        <w:t xml:space="preserve"> </w:t>
-      </w:r>
-      <w:r>
-        <w:rPr>
-          <w:noProof/>
-          <w:color w:val="000000"/>
-        </w:rPr>
-        <w:t>experiment</w:t>
-      </w:r>
-      <w:r>
-        <w:rPr>
-          <w:color w:val="000000"/>
-          <w:w w:val="95"/>
-        </w:rPr>
-        <w:t xml:space="preserve"> </w:t>
-      </w:r>
-      <w:r>
-        <w:rPr>
-          <w:noProof/>
-          <w:color w:val="000000"/>
-        </w:rPr>
-        <w:t>tracking.</w:t>
-      </w:r>
-      <w:r>
-        <w:rPr>
-          <w:color w:val="000000"/>
-        </w:rPr>
-        <w:t xml:space="preserve"> </w:t>
+        <w:t>Designed a systematic evaluation framework with safety policy diagnostics, collaborating within the AI Firewall team and using Weights &amp; Biases for experiment tracking.</w:t>
       </w:r>
     </w:p>
     <w:p>

</xml_diff>